<commit_message>
Recolor CIFSO certification forms to cobalt / SOC co-branding (v2.0)
Mechanical recolor pass per COBALT_REBRAND_PLAN.md: RED (#FF002B) renamed to
COBALT (#1B4FA0) throughout shared.js and all four build scripts, and the header
logo switched from the Valletta-only mark to the combined Valletta+SOC lockup
(sized 110x85 to preserve its near-square aspect ratio, vs. the old wide banner
mark). No content changes — checkbox/dropdown/date-picker control counts verified
identical before and after in all four documents.

Co-Authored-By: Claude Sonnet 5 <noreply@anthropic.com>
Claude-Session: https://claude.ai/code/session_01MW2NfkMi5UUsKy9x4vEp7k
</commit_message>
<xml_diff>
--- a/exports/cifso-certification-forms/valletta_new_hire_employment_eligibility.docx
+++ b/exports/cifso-certification-forms/valletta_new_hire_employment_eligibility.docx
@@ -21,7 +21,7 @@
     <w:p>
       <w:pPr>
         <w:pBdr>
-          <w:bottom w:val="single" w:color="FF002B" w:sz="18" w:space="4"/>
+          <w:bottom w:val="single" w:color="1B4FA0" w:sz="18" w:space="4"/>
         </w:pBdr>
         <w:spacing w:after="160"/>
       </w:pPr>
@@ -59,7 +59,7 @@
           <w:rFonts w:ascii="Arial" w:cs="Arial" w:eastAsia="Arial" w:hAnsi="Arial"/>
           <w:b/>
           <w:bCs/>
-          <w:color w:val="FF002B"/>
+          <w:color w:val="1B4FA0"/>
           <w:spacing w:val="3"/>
           <w:sz w:val="15"/>
           <w:szCs w:val="15"/>
@@ -86,7 +86,7 @@
           <w:rFonts w:ascii="Arial" w:cs="Arial" w:eastAsia="Arial" w:hAnsi="Arial"/>
           <w:b/>
           <w:bCs/>
-          <w:color w:val="FF002B"/>
+          <w:color w:val="1B4FA0"/>
           <w:spacing w:val="3"/>
           <w:sz w:val="15"/>
           <w:szCs w:val="15"/>
@@ -145,7 +145,7 @@
                 <w:rFonts w:ascii="Arial" w:cs="Arial" w:eastAsia="Arial" w:hAnsi="Arial"/>
                 <w:b/>
                 <w:bCs/>
-                <w:color w:val="FF002B"/>
+                <w:color w:val="1B4FA0"/>
                 <w:spacing w:val="3"/>
                 <w:sz w:val="15"/>
                 <w:szCs w:val="15"/>
@@ -188,7 +188,7 @@
                 <w:rFonts w:ascii="Arial" w:cs="Arial" w:eastAsia="Arial" w:hAnsi="Arial"/>
                 <w:b/>
                 <w:bCs/>
-                <w:color w:val="FF002B"/>
+                <w:color w:val="1B4FA0"/>
                 <w:spacing w:val="3"/>
                 <w:sz w:val="15"/>
                 <w:szCs w:val="15"/>
@@ -317,7 +317,7 @@
                 <w:rFonts w:ascii="Arial" w:cs="Arial" w:eastAsia="Arial" w:hAnsi="Arial"/>
                 <w:b/>
                 <w:bCs/>
-                <w:color w:val="FF002B"/>
+                <w:color w:val="1B4FA0"/>
                 <w:spacing w:val="3"/>
                 <w:sz w:val="15"/>
                 <w:szCs w:val="15"/>
@@ -383,7 +383,7 @@
                 <w:rFonts w:ascii="Arial" w:cs="Arial" w:eastAsia="Arial" w:hAnsi="Arial"/>
                 <w:b/>
                 <w:bCs/>
-                <w:color w:val="FF002B"/>
+                <w:color w:val="1B4FA0"/>
                 <w:spacing w:val="3"/>
                 <w:sz w:val="15"/>
                 <w:szCs w:val="15"/>
@@ -651,7 +651,7 @@
                 <w:rFonts w:ascii="Arial" w:cs="Arial" w:eastAsia="Arial" w:hAnsi="Arial"/>
                 <w:b/>
                 <w:bCs/>
-                <w:color w:val="FF002B"/>
+                <w:color w:val="1B4FA0"/>
                 <w:spacing w:val="3"/>
                 <w:sz w:val="15"/>
                 <w:szCs w:val="15"/>
@@ -694,7 +694,7 @@
                 <w:rFonts w:ascii="Arial" w:cs="Arial" w:eastAsia="Arial" w:hAnsi="Arial"/>
                 <w:b/>
                 <w:bCs/>
-                <w:color w:val="FF002B"/>
+                <w:color w:val="1B4FA0"/>
                 <w:spacing w:val="3"/>
                 <w:sz w:val="15"/>
                 <w:szCs w:val="15"/>
@@ -742,7 +742,7 @@
           <w:rFonts w:ascii="Arial" w:cs="Arial" w:eastAsia="Arial" w:hAnsi="Arial"/>
           <w:b/>
           <w:bCs/>
-          <w:color w:val="FF002B"/>
+          <w:color w:val="1B4FA0"/>
           <w:spacing w:val="3"/>
           <w:sz w:val="15"/>
           <w:szCs w:val="15"/>
@@ -769,7 +769,7 @@
           <w:rFonts w:ascii="Arial" w:cs="Arial" w:eastAsia="Arial" w:hAnsi="Arial"/>
           <w:b/>
           <w:bCs/>
-          <w:color w:val="FF002B"/>
+          <w:color w:val="1B4FA0"/>
           <w:spacing w:val="3"/>
           <w:sz w:val="15"/>
           <w:szCs w:val="15"/>
@@ -828,7 +828,7 @@
                 <w:rFonts w:ascii="Arial" w:cs="Arial" w:eastAsia="Arial" w:hAnsi="Arial"/>
                 <w:b/>
                 <w:bCs/>
-                <w:color w:val="FF002B"/>
+                <w:color w:val="1B4FA0"/>
                 <w:spacing w:val="3"/>
                 <w:sz w:val="15"/>
                 <w:szCs w:val="15"/>
@@ -890,7 +890,7 @@
                 <w:rFonts w:ascii="Arial" w:cs="Arial" w:eastAsia="Arial" w:hAnsi="Arial"/>
                 <w:b/>
                 <w:bCs/>
-                <w:color w:val="FF002B"/>
+                <w:color w:val="1B4FA0"/>
                 <w:spacing w:val="3"/>
                 <w:sz w:val="15"/>
                 <w:szCs w:val="15"/>
@@ -939,7 +939,7 @@
           <w:rFonts w:ascii="Arial" w:cs="Arial" w:eastAsia="Arial" w:hAnsi="Arial"/>
           <w:b/>
           <w:bCs/>
-          <w:color w:val="FF002B"/>
+          <w:color w:val="1B4FA0"/>
           <w:spacing w:val="3"/>
           <w:sz w:val="15"/>
           <w:szCs w:val="15"/>
@@ -987,7 +987,7 @@
           <w:rFonts w:ascii="Arial" w:cs="Arial" w:eastAsia="Arial" w:hAnsi="Arial"/>
           <w:b/>
           <w:bCs/>
-          <w:color w:val="FF002B"/>
+          <w:color w:val="1B4FA0"/>
           <w:spacing w:val="3"/>
           <w:sz w:val="15"/>
           <w:szCs w:val="15"/>
@@ -1032,7 +1032,7 @@
           <w:rFonts w:ascii="Arial" w:cs="Arial" w:eastAsia="Arial" w:hAnsi="Arial"/>
           <w:b/>
           <w:bCs/>
-          <w:color w:val="FF002B"/>
+          <w:color w:val="1B4FA0"/>
           <w:spacing w:val="3"/>
           <w:sz w:val="15"/>
           <w:szCs w:val="15"/>
@@ -1059,7 +1059,7 @@
           <w:rFonts w:ascii="Arial" w:cs="Arial" w:eastAsia="Arial" w:hAnsi="Arial"/>
           <w:b/>
           <w:bCs/>
-          <w:color w:val="FF002B"/>
+          <w:color w:val="1B4FA0"/>
           <w:spacing w:val="3"/>
           <w:sz w:val="15"/>
           <w:szCs w:val="15"/>
@@ -1086,7 +1086,7 @@
           <w:rFonts w:ascii="Arial" w:cs="Arial" w:eastAsia="Arial" w:hAnsi="Arial"/>
           <w:b/>
           <w:bCs/>
-          <w:color w:val="FF002B"/>
+          <w:color w:val="1B4FA0"/>
           <w:spacing w:val="3"/>
           <w:sz w:val="15"/>
           <w:szCs w:val="15"/>
@@ -1113,7 +1113,7 @@
           <w:rFonts w:ascii="Arial" w:cs="Arial" w:eastAsia="Arial" w:hAnsi="Arial"/>
           <w:b/>
           <w:bCs/>
-          <w:color w:val="FF002B"/>
+          <w:color w:val="1B4FA0"/>
           <w:spacing w:val="3"/>
           <w:sz w:val="15"/>
           <w:szCs w:val="15"/>
@@ -1140,7 +1140,7 @@
           <w:rFonts w:ascii="Arial" w:cs="Arial" w:eastAsia="Arial" w:hAnsi="Arial"/>
           <w:b/>
           <w:bCs/>
-          <w:color w:val="FF002B"/>
+          <w:color w:val="1B4FA0"/>
           <w:spacing w:val="3"/>
           <w:sz w:val="15"/>
           <w:szCs w:val="15"/>
@@ -1185,7 +1185,7 @@
           <w:rFonts w:ascii="Arial" w:cs="Arial" w:eastAsia="Arial" w:hAnsi="Arial"/>
           <w:b/>
           <w:bCs/>
-          <w:color w:val="FF002B"/>
+          <w:color w:val="1B4FA0"/>
           <w:spacing w:val="3"/>
           <w:sz w:val="15"/>
           <w:szCs w:val="15"/>
@@ -1230,7 +1230,7 @@
           <w:rFonts w:ascii="Arial" w:cs="Arial" w:eastAsia="Arial" w:hAnsi="Arial"/>
           <w:b/>
           <w:bCs/>
-          <w:color w:val="FF002B"/>
+          <w:color w:val="1B4FA0"/>
           <w:spacing w:val="3"/>
           <w:sz w:val="15"/>
           <w:szCs w:val="15"/>
@@ -1275,7 +1275,7 @@
           <w:rFonts w:ascii="Arial" w:cs="Arial" w:eastAsia="Arial" w:hAnsi="Arial"/>
           <w:b/>
           <w:bCs/>
-          <w:color w:val="FF002B"/>
+          <w:color w:val="1B4FA0"/>
           <w:spacing w:val="3"/>
           <w:sz w:val="15"/>
           <w:szCs w:val="15"/>
@@ -1320,7 +1320,7 @@
           <w:rFonts w:ascii="Arial" w:cs="Arial" w:eastAsia="Arial" w:hAnsi="Arial"/>
           <w:b/>
           <w:bCs/>
-          <w:color w:val="FF002B"/>
+          <w:color w:val="1B4FA0"/>
           <w:spacing w:val="3"/>
           <w:sz w:val="15"/>
           <w:szCs w:val="15"/>
@@ -1365,7 +1365,7 @@
           <w:rFonts w:ascii="Arial" w:cs="Arial" w:eastAsia="Arial" w:hAnsi="Arial"/>
           <w:b/>
           <w:bCs/>
-          <w:color w:val="FF002B"/>
+          <w:color w:val="1B4FA0"/>
           <w:spacing w:val="3"/>
           <w:sz w:val="15"/>
           <w:szCs w:val="15"/>
@@ -1442,7 +1442,7 @@
                 <w:rFonts w:ascii="Arial" w:cs="Arial" w:eastAsia="Arial" w:hAnsi="Arial"/>
                 <w:b/>
                 <w:bCs/>
-                <w:color w:val="FF002B"/>
+                <w:color w:val="1B4FA0"/>
                 <w:spacing w:val="3"/>
                 <w:sz w:val="15"/>
                 <w:szCs w:val="15"/>
@@ -1503,7 +1503,7 @@
                 <w:rFonts w:ascii="Arial" w:cs="Arial" w:eastAsia="Arial" w:hAnsi="Arial"/>
                 <w:b/>
                 <w:bCs/>
-                <w:color w:val="FF002B"/>
+                <w:color w:val="1B4FA0"/>
                 <w:spacing w:val="3"/>
                 <w:sz w:val="15"/>
                 <w:szCs w:val="15"/>
@@ -1584,7 +1584,7 @@
                 <w:rFonts w:ascii="Arial" w:cs="Arial" w:eastAsia="Arial" w:hAnsi="Arial"/>
                 <w:b/>
                 <w:bCs/>
-                <w:color w:val="FF002B"/>
+                <w:color w:val="1B4FA0"/>
                 <w:spacing w:val="3"/>
                 <w:sz w:val="15"/>
                 <w:szCs w:val="15"/>
@@ -1645,7 +1645,7 @@
                 <w:rFonts w:ascii="Arial" w:cs="Arial" w:eastAsia="Arial" w:hAnsi="Arial"/>
                 <w:b/>
                 <w:bCs/>
-                <w:color w:val="FF002B"/>
+                <w:color w:val="1B4FA0"/>
                 <w:spacing w:val="3"/>
                 <w:sz w:val="15"/>
                 <w:szCs w:val="15"/>
@@ -1726,7 +1726,7 @@
                 <w:rFonts w:ascii="Arial" w:cs="Arial" w:eastAsia="Arial" w:hAnsi="Arial"/>
                 <w:b/>
                 <w:bCs/>
-                <w:color w:val="FF002B"/>
+                <w:color w:val="1B4FA0"/>
                 <w:spacing w:val="3"/>
                 <w:sz w:val="15"/>
                 <w:szCs w:val="15"/>
@@ -1787,7 +1787,7 @@
                 <w:rFonts w:ascii="Arial" w:cs="Arial" w:eastAsia="Arial" w:hAnsi="Arial"/>
                 <w:b/>
                 <w:bCs/>
-                <w:color w:val="FF002B"/>
+                <w:color w:val="1B4FA0"/>
                 <w:spacing w:val="3"/>
                 <w:sz w:val="15"/>
                 <w:szCs w:val="15"/>
@@ -1854,7 +1854,7 @@
           <w:rFonts w:ascii="Arial" w:cs="Arial" w:eastAsia="Arial" w:hAnsi="Arial"/>
           <w:b/>
           <w:bCs/>
-          <w:color w:val="FF002B"/>
+          <w:color w:val="1B4FA0"/>
           <w:spacing w:val="3"/>
           <w:sz w:val="15"/>
           <w:szCs w:val="15"/>
@@ -1899,7 +1899,7 @@
           <w:rFonts w:ascii="Arial" w:cs="Arial" w:eastAsia="Arial" w:hAnsi="Arial"/>
           <w:b/>
           <w:bCs/>
-          <w:color w:val="FF002B"/>
+          <w:color w:val="1B4FA0"/>
           <w:spacing w:val="3"/>
           <w:sz w:val="15"/>
           <w:szCs w:val="15"/>
@@ -1944,7 +1944,7 @@
           <w:rFonts w:ascii="Arial" w:cs="Arial" w:eastAsia="Arial" w:hAnsi="Arial"/>
           <w:b/>
           <w:bCs/>
-          <w:color w:val="FF002B"/>
+          <w:color w:val="1B4FA0"/>
           <w:spacing w:val="3"/>
           <w:sz w:val="15"/>
           <w:szCs w:val="15"/>
@@ -1989,7 +1989,7 @@
           <w:rFonts w:ascii="Arial" w:cs="Arial" w:eastAsia="Arial" w:hAnsi="Arial"/>
           <w:b/>
           <w:bCs/>
-          <w:color w:val="FF002B"/>
+          <w:color w:val="1B4FA0"/>
           <w:spacing w:val="3"/>
           <w:sz w:val="15"/>
           <w:szCs w:val="15"/>
@@ -2034,7 +2034,7 @@
           <w:rFonts w:ascii="Arial" w:cs="Arial" w:eastAsia="Arial" w:hAnsi="Arial"/>
           <w:b/>
           <w:bCs/>
-          <w:color w:val="FF002B"/>
+          <w:color w:val="1B4FA0"/>
           <w:spacing w:val="3"/>
           <w:sz w:val="15"/>
           <w:szCs w:val="15"/>
@@ -2079,7 +2079,7 @@
           <w:rFonts w:ascii="Arial" w:cs="Arial" w:eastAsia="Arial" w:hAnsi="Arial"/>
           <w:b/>
           <w:bCs/>
-          <w:color w:val="FF002B"/>
+          <w:color w:val="1B4FA0"/>
           <w:spacing w:val="3"/>
           <w:sz w:val="15"/>
           <w:szCs w:val="15"/>
@@ -2174,7 +2174,7 @@
                 <w:rFonts w:ascii="Arial" w:cs="Arial" w:eastAsia="Arial" w:hAnsi="Arial"/>
                 <w:b/>
                 <w:bCs/>
-                <w:color w:val="FF002B"/>
+                <w:color w:val="1B4FA0"/>
                 <w:spacing w:val="3"/>
                 <w:sz w:val="15"/>
                 <w:szCs w:val="15"/>
@@ -2236,7 +2236,7 @@
                 <w:rFonts w:ascii="Arial" w:cs="Arial" w:eastAsia="Arial" w:hAnsi="Arial"/>
                 <w:b/>
                 <w:bCs/>
-                <w:color w:val="FF002B"/>
+                <w:color w:val="1B4FA0"/>
                 <w:spacing w:val="3"/>
                 <w:sz w:val="15"/>
                 <w:szCs w:val="15"/>
@@ -2317,7 +2317,7 @@
                 <w:rFonts w:ascii="Arial" w:cs="Arial" w:eastAsia="Arial" w:hAnsi="Arial"/>
                 <w:b/>
                 <w:bCs/>
-                <w:color w:val="FF002B"/>
+                <w:color w:val="1B4FA0"/>
                 <w:spacing w:val="3"/>
                 <w:sz w:val="15"/>
                 <w:szCs w:val="15"/>
@@ -2360,7 +2360,7 @@
                 <w:rFonts w:ascii="Arial" w:cs="Arial" w:eastAsia="Arial" w:hAnsi="Arial"/>
                 <w:b/>
                 <w:bCs/>
-                <w:color w:val="FF002B"/>
+                <w:color w:val="1B4FA0"/>
                 <w:spacing w:val="3"/>
                 <w:sz w:val="15"/>
                 <w:szCs w:val="15"/>
@@ -2471,7 +2471,7 @@
                 <w:rFonts w:ascii="Arial" w:cs="Arial" w:eastAsia="Arial" w:hAnsi="Arial"/>
                 <w:b/>
                 <w:bCs/>
-                <w:color w:val="FF002B"/>
+                <w:color w:val="1B4FA0"/>
                 <w:spacing w:val="3"/>
                 <w:sz w:val="15"/>
                 <w:szCs w:val="15"/>
@@ -2533,7 +2533,7 @@
                 <w:rFonts w:ascii="Arial" w:cs="Arial" w:eastAsia="Arial" w:hAnsi="Arial"/>
                 <w:b/>
                 <w:bCs/>
-                <w:color w:val="FF002B"/>
+                <w:color w:val="1B4FA0"/>
                 <w:spacing w:val="3"/>
                 <w:sz w:val="15"/>
                 <w:szCs w:val="15"/>
@@ -2563,7 +2563,7 @@
           <w:rFonts w:ascii="Arial" w:cs="Arial" w:eastAsia="Arial" w:hAnsi="Arial"/>
           <w:b/>
           <w:bCs/>
-          <w:color w:val="FF002B"/>
+          <w:color w:val="1B4FA0"/>
           <w:spacing w:val="3"/>
           <w:sz w:val="15"/>
           <w:szCs w:val="15"/>
@@ -2623,7 +2623,7 @@
                 <w:rFonts w:ascii="Arial" w:cs="Arial" w:eastAsia="Arial" w:hAnsi="Arial"/>
                 <w:b/>
                 <w:bCs/>
-                <w:color w:val="FF002B"/>
+                <w:color w:val="1B4FA0"/>
                 <w:spacing w:val="3"/>
                 <w:sz w:val="15"/>
                 <w:szCs w:val="15"/>
@@ -2666,7 +2666,7 @@
                 <w:rFonts w:ascii="Arial" w:cs="Arial" w:eastAsia="Arial" w:hAnsi="Arial"/>
                 <w:b/>
                 <w:bCs/>
-                <w:color w:val="FF002B"/>
+                <w:color w:val="1B4FA0"/>
                 <w:spacing w:val="3"/>
                 <w:sz w:val="15"/>
                 <w:szCs w:val="15"/>
@@ -2709,7 +2709,7 @@
                 <w:rFonts w:ascii="Arial" w:cs="Arial" w:eastAsia="Arial" w:hAnsi="Arial"/>
                 <w:b/>
                 <w:bCs/>
-                <w:color w:val="FF002B"/>
+                <w:color w:val="1B4FA0"/>
                 <w:spacing w:val="3"/>
                 <w:sz w:val="15"/>
                 <w:szCs w:val="15"/>
@@ -2739,7 +2739,7 @@
           <w:rFonts w:ascii="Arial" w:cs="Arial" w:eastAsia="Arial" w:hAnsi="Arial"/>
           <w:b/>
           <w:bCs/>
-          <w:color w:val="FF002B"/>
+          <w:color w:val="1B4FA0"/>
           <w:spacing w:val="3"/>
           <w:sz w:val="15"/>
           <w:szCs w:val="15"/>
@@ -2816,7 +2816,7 @@
                 <w:rFonts w:ascii="Arial" w:cs="Arial" w:eastAsia="Arial" w:hAnsi="Arial"/>
                 <w:b/>
                 <w:bCs/>
-                <w:color w:val="FF002B"/>
+                <w:color w:val="1B4FA0"/>
                 <w:spacing w:val="3"/>
                 <w:sz w:val="15"/>
                 <w:szCs w:val="15"/>
@@ -2878,7 +2878,7 @@
                 <w:rFonts w:ascii="Arial" w:cs="Arial" w:eastAsia="Arial" w:hAnsi="Arial"/>
                 <w:b/>
                 <w:bCs/>
-                <w:color w:val="FF002B"/>
+                <w:color w:val="1B4FA0"/>
                 <w:spacing w:val="3"/>
                 <w:sz w:val="15"/>
                 <w:szCs w:val="15"/>
@@ -2927,7 +2927,7 @@
           <w:rFonts w:ascii="Arial" w:cs="Arial" w:eastAsia="Arial" w:hAnsi="Arial"/>
           <w:b/>
           <w:bCs/>
-          <w:color w:val="FF002B"/>
+          <w:color w:val="1B4FA0"/>
           <w:spacing w:val="3"/>
           <w:sz w:val="15"/>
           <w:szCs w:val="15"/>
@@ -2954,7 +2954,7 @@
           <w:rFonts w:ascii="Arial" w:cs="Arial" w:eastAsia="Arial" w:hAnsi="Arial"/>
           <w:b/>
           <w:bCs/>
-          <w:color w:val="FF002B"/>
+          <w:color w:val="1B4FA0"/>
           <w:spacing w:val="3"/>
           <w:sz w:val="15"/>
           <w:szCs w:val="15"/>
@@ -3031,7 +3031,7 @@
                 <w:rFonts w:ascii="Arial" w:cs="Arial" w:eastAsia="Arial" w:hAnsi="Arial"/>
                 <w:b/>
                 <w:bCs/>
-                <w:color w:val="FF002B"/>
+                <w:color w:val="1B4FA0"/>
                 <w:spacing w:val="3"/>
                 <w:sz w:val="15"/>
                 <w:szCs w:val="15"/>
@@ -3074,7 +3074,7 @@
                 <w:rFonts w:ascii="Arial" w:cs="Arial" w:eastAsia="Arial" w:hAnsi="Arial"/>
                 <w:b/>
                 <w:bCs/>
-                <w:color w:val="FF002B"/>
+                <w:color w:val="1B4FA0"/>
                 <w:spacing w:val="3"/>
                 <w:sz w:val="15"/>
                 <w:szCs w:val="15"/>
@@ -3122,7 +3122,7 @@
           <w:rFonts w:ascii="Arial" w:cs="Arial" w:eastAsia="Arial" w:hAnsi="Arial"/>
           <w:b/>
           <w:bCs/>
-          <w:color w:val="FF002B"/>
+          <w:color w:val="1B4FA0"/>
           <w:spacing w:val="3"/>
           <w:sz w:val="15"/>
           <w:szCs w:val="15"/>
@@ -3181,7 +3181,7 @@
                 <w:rFonts w:ascii="Arial" w:cs="Arial" w:eastAsia="Arial" w:hAnsi="Arial"/>
                 <w:b/>
                 <w:bCs/>
-                <w:color w:val="FF002B"/>
+                <w:color w:val="1B4FA0"/>
                 <w:spacing w:val="3"/>
                 <w:sz w:val="15"/>
                 <w:szCs w:val="15"/>
@@ -3224,7 +3224,7 @@
                 <w:rFonts w:ascii="Arial" w:cs="Arial" w:eastAsia="Arial" w:hAnsi="Arial"/>
                 <w:b/>
                 <w:bCs/>
-                <w:color w:val="FF002B"/>
+                <w:color w:val="1B4FA0"/>
                 <w:spacing w:val="3"/>
                 <w:sz w:val="15"/>
                 <w:szCs w:val="15"/>
@@ -3365,7 +3365,7 @@
           <w:rFonts w:ascii="Arial" w:cs="Arial" w:eastAsia="Arial" w:hAnsi="Arial"/>
           <w:b/>
           <w:bCs/>
-          <w:color w:val="FF002B"/>
+          <w:color w:val="1B4FA0"/>
           <w:spacing w:val="3"/>
           <w:sz w:val="15"/>
           <w:szCs w:val="15"/>
@@ -3383,7 +3383,7 @@
     <w:p>
       <w:pPr>
         <w:pBdr>
-          <w:bottom w:val="single" w:color="FF002B" w:sz="10" w:space="4"/>
+          <w:bottom w:val="single" w:color="1B4FA0" w:sz="10" w:space="4"/>
         </w:pBdr>
         <w:spacing w:after="120" w:before="200"/>
       </w:pPr>
@@ -3459,7 +3459,7 @@
                 <w:rFonts w:ascii="Arial" w:cs="Arial" w:eastAsia="Arial" w:hAnsi="Arial"/>
                 <w:b/>
                 <w:bCs/>
-                <w:color w:val="FF002B"/>
+                <w:color w:val="1B4FA0"/>
                 <w:spacing w:val="3"/>
                 <w:sz w:val="15"/>
                 <w:szCs w:val="15"/>
@@ -3502,7 +3502,7 @@
                 <w:rFonts w:ascii="Arial" w:cs="Arial" w:eastAsia="Arial" w:hAnsi="Arial"/>
                 <w:b/>
                 <w:bCs/>
-                <w:color w:val="FF002B"/>
+                <w:color w:val="1B4FA0"/>
                 <w:spacing w:val="3"/>
                 <w:sz w:val="15"/>
                 <w:szCs w:val="15"/>
@@ -3542,7 +3542,7 @@
     <w:p>
       <w:pPr>
         <w:pBdr>
-          <w:bottom w:val="single" w:color="FF002B" w:sz="10" w:space="4"/>
+          <w:bottom w:val="single" w:color="1B4FA0" w:sz="10" w:space="4"/>
         </w:pBdr>
         <w:spacing w:after="120" w:before="200"/>
       </w:pPr>
@@ -3574,7 +3574,7 @@
       <w:r>
         <w:rPr>
           <w:rFonts w:ascii="Calibri" w:cs="Calibri" w:eastAsia="Calibri" w:hAnsi="Calibri"/>
-          <w:color w:val="FF002B"/>
+          <w:color w:val="1B4FA0"/>
           <w:sz w:val="20"/>
           <w:szCs w:val="20"/>
         </w:rPr>
@@ -3592,7 +3592,7 @@
       <w:r>
         <w:rPr>
           <w:rFonts w:ascii="Calibri" w:cs="Calibri" w:eastAsia="Calibri" w:hAnsi="Calibri"/>
-          <w:color w:val="FF002B"/>
+          <w:color w:val="1B4FA0"/>
           <w:sz w:val="20"/>
           <w:szCs w:val="20"/>
         </w:rPr>
@@ -3633,7 +3633,7 @@
           <w:rFonts w:ascii="Arial" w:cs="Arial" w:eastAsia="Arial" w:hAnsi="Arial"/>
           <w:b/>
           <w:bCs/>
-          <w:color w:val="FF002B"/>
+          <w:color w:val="1B4FA0"/>
           <w:spacing w:val="3"/>
           <w:sz w:val="15"/>
           <w:szCs w:val="15"/>
@@ -3701,7 +3701,7 @@
           <w:rFonts w:ascii="Arial" w:cs="Arial" w:eastAsia="Arial" w:hAnsi="Arial"/>
           <w:b/>
           <w:bCs/>
-          <w:color w:val="FF002B"/>
+          <w:color w:val="1B4FA0"/>
           <w:spacing w:val="3"/>
           <w:sz w:val="15"/>
           <w:szCs w:val="15"/>
@@ -3769,7 +3769,7 @@
           <w:rFonts w:ascii="Arial" w:cs="Arial" w:eastAsia="Arial" w:hAnsi="Arial"/>
           <w:b/>
           <w:bCs/>
-          <w:color w:val="FF002B"/>
+          <w:color w:val="1B4FA0"/>
           <w:spacing w:val="3"/>
           <w:sz w:val="15"/>
           <w:szCs w:val="15"/>
@@ -3837,7 +3837,7 @@
           <w:rFonts w:ascii="Arial" w:cs="Arial" w:eastAsia="Arial" w:hAnsi="Arial"/>
           <w:b/>
           <w:bCs/>
-          <w:color w:val="FF002B"/>
+          <w:color w:val="1B4FA0"/>
           <w:spacing w:val="3"/>
           <w:sz w:val="15"/>
           <w:szCs w:val="15"/>
@@ -4027,7 +4027,7 @@
   <w:p>
     <w:pPr>
       <w:pBdr>
-        <w:bottom w:val="single" w:color="FF002B" w:sz="16" w:space="8"/>
+        <w:bottom w:val="single" w:color="1B4FA0" w:sz="16" w:space="8"/>
       </w:pBdr>
       <w:tabs>
         <w:tab w:val="right" w:pos="9792"/>
@@ -4036,7 +4036,7 @@
     <w:r>
       <w:drawing>
         <wp:inline distT="0" distB="0" distL="0" distR="0">
-          <wp:extent cx="1428750" cy="285750"/>
+          <wp:extent cx="1047750" cy="809625"/>
           <wp:effectExtent t="0" r="0" b="0" l="0"/>
           <wp:docPr id="1" name="" descr="" title=""/>
           <wp:cNvGraphicFramePr>
@@ -4061,7 +4061,7 @@
                 <pic:spPr bwMode="auto">
                   <a:xfrm>
                     <a:off x="0" y="0"/>
-                    <a:ext cx="1428750" cy="285750"/>
+                    <a:ext cx="1047750" cy="809625"/>
                   </a:xfrm>
                   <a:prstGeom prst="rect">
                     <a:avLst/>

</xml_diff>